<commit_message>
switching DB and ML sessions
</commit_message>
<xml_diff>
--- a/Syllabus/Syllabus_ Introduction to Computation for Social Sciences.docx
+++ b/Syllabus/Syllabus_ Introduction to Computation for Social Sciences.docx
@@ -25,17 +25,7 @@
           <w:sz w:val="36"/>
           <w:szCs w:val="36"/>
         </w:rPr>
-        <w:t xml:space="preserve">Introduction to Computing for the Social Sciences </w:t>
-      </w:r>
-      <w:r>
-        <w:rPr>
-          <w:b/>
-          <w:bCs/>
-          <w:color w:val="000000"/>
-          <w:sz w:val="36"/>
-          <w:szCs w:val="36"/>
-        </w:rPr>
-        <w:t>(Theory)</w:t>
+        <w:t>Introduction to Computing for the Social Sciences (Theory)</w:t>
       </w:r>
     </w:p>
     <w:p>
@@ -56,46 +46,7 @@
           <w:sz w:val="28"/>
           <w:szCs w:val="28"/>
         </w:rPr>
-        <w:t>WS 202</w:t>
-      </w:r>
-      <w:r>
-        <w:rPr>
-          <w:b/>
-          <w:bCs/>
-          <w:color w:val="000000"/>
-          <w:sz w:val="28"/>
-          <w:szCs w:val="28"/>
-        </w:rPr>
-        <w:t>6</w:t>
-      </w:r>
-      <w:r>
-        <w:rPr>
-          <w:b/>
-          <w:bCs/>
-          <w:color w:val="000000"/>
-          <w:sz w:val="28"/>
-          <w:szCs w:val="28"/>
-        </w:rPr>
-        <w:t>/2</w:t>
-      </w:r>
-      <w:r>
-        <w:rPr>
-          <w:b/>
-          <w:bCs/>
-          <w:color w:val="000000"/>
-          <w:sz w:val="28"/>
-          <w:szCs w:val="28"/>
-        </w:rPr>
-        <w:t>7</w:t>
-      </w:r>
-      <w:r>
-        <w:rPr>
-          <w:b/>
-          <w:bCs/>
-          <w:color w:val="000000"/>
-          <w:sz w:val="28"/>
-          <w:szCs w:val="28"/>
-        </w:rPr>
+        <w:t>WS 2026/27</w:t>
         <w:br/>
         <w:t>Lecturer: David Garcia</w:t>
         <w:br/>
@@ -141,19 +92,7 @@
         <w:rPr>
           <w:color w:val="auto"/>
         </w:rPr>
-        <w:t xml:space="preserve">Lecture: </w:t>
-      </w:r>
-      <w:r>
-        <w:rPr>
-          <w:color w:val="auto"/>
-        </w:rPr>
-        <w:t>Wednesdays</w:t>
-      </w:r>
-      <w:r>
-        <w:rPr>
-          <w:color w:val="auto"/>
-        </w:rPr>
-        <w:t xml:space="preserve"> 10:00-11:30</w:t>
+        <w:t>Lecture: Wednesdays 10:00-11:30</w:t>
       </w:r>
       <w:bookmarkStart w:id="1" w:name="docs-internal-guid-3fa86b5f-7fff-3a79-6c"/>
       <w:bookmarkEnd w:id="1"/>
@@ -178,7 +117,23 @@
           <w:effect w:val="none"/>
           <w:shd w:fill="auto" w:val="clear"/>
         </w:rPr>
-        <w:t>D</w:t>
+        <w:t>D301</w:t>
+      </w:r>
+    </w:p>
+    <w:p>
+      <w:pPr>
+        <w:pStyle w:val="LO-normal"/>
+        <w:pageBreakBefore w:val="false"/>
+        <w:jc w:val="left"/>
+        <w:rPr>
+          <w:color w:val="auto"/>
+        </w:rPr>
+      </w:pPr>
+      <w:r>
+        <w:rPr>
+          <w:color w:val="auto"/>
+        </w:rPr>
+        <w:t xml:space="preserve">Exercises: Tuesdays 15:15-16:45, </w:t>
       </w:r>
       <w:r>
         <w:rPr>
@@ -195,41 +150,30 @@
           <w:effect w:val="none"/>
           <w:shd w:fill="auto" w:val="clear"/>
         </w:rPr>
-        <w:t>3</w:t>
-      </w:r>
-      <w:r>
-        <w:rPr>
-          <w:rFonts w:ascii="Arial;sans-serif" w:hAnsi="Arial;sans-serif"/>
-          <w:b w:val="false"/>
-          <w:i w:val="false"/>
-          <w:caps w:val="false"/>
-          <w:smallCaps w:val="false"/>
-          <w:strike w:val="false"/>
-          <w:dstrike w:val="false"/>
-          <w:color w:val="000000"/>
-          <w:sz w:val="22"/>
-          <w:u w:val="none"/>
-          <w:effect w:val="none"/>
-          <w:shd w:fill="auto" w:val="clear"/>
-        </w:rPr>
-        <w:t>0</w:t>
-      </w:r>
-      <w:r>
-        <w:rPr>
-          <w:rFonts w:ascii="Arial;sans-serif" w:hAnsi="Arial;sans-serif"/>
-          <w:b w:val="false"/>
-          <w:i w:val="false"/>
-          <w:caps w:val="false"/>
-          <w:smallCaps w:val="false"/>
-          <w:strike w:val="false"/>
-          <w:dstrike w:val="false"/>
-          <w:color w:val="000000"/>
-          <w:sz w:val="22"/>
-          <w:u w:val="none"/>
-          <w:effect w:val="none"/>
-          <w:shd w:fill="auto" w:val="clear"/>
-        </w:rPr>
-        <w:t>1</w:t>
+        <w:t>D301</w:t>
+      </w:r>
+      <w:r>
+        <w:rPr>
+          <w:color w:val="auto"/>
+        </w:rPr>
+        <w:br/>
+      </w:r>
+    </w:p>
+    <w:p>
+      <w:pPr>
+        <w:pStyle w:val="LO-normal"/>
+        <w:jc w:val="left"/>
+        <w:rPr>
+          <w:color w:val="auto"/>
+        </w:rPr>
+      </w:pPr>
+      <w:r>
+        <w:rPr>
+          <w:b/>
+          <w:bCs/>
+          <w:color w:val="000000"/>
+        </w:rPr>
+        <w:t>Course Description</w:t>
       </w:r>
     </w:p>
     <w:p>
@@ -238,173 +182,6 @@
         <w:pageBreakBefore w:val="false"/>
         <w:jc w:val="left"/>
         <w:rPr>
-          <w:color w:val="auto"/>
-        </w:rPr>
-      </w:pPr>
-      <w:r>
-        <w:rPr>
-          <w:color w:val="auto"/>
-        </w:rPr>
-        <w:t xml:space="preserve">Exercises: </w:t>
-      </w:r>
-      <w:r>
-        <w:rPr>
-          <w:color w:val="auto"/>
-        </w:rPr>
-        <w:t>Tuesdays</w:t>
-      </w:r>
-      <w:r>
-        <w:rPr>
-          <w:color w:val="auto"/>
-        </w:rPr>
-        <w:t xml:space="preserve"> 1</w:t>
-      </w:r>
-      <w:r>
-        <w:rPr>
-          <w:color w:val="auto"/>
-        </w:rPr>
-        <w:t>5</w:t>
-      </w:r>
-      <w:r>
-        <w:rPr>
-          <w:color w:val="auto"/>
-        </w:rPr>
-        <w:t>:</w:t>
-      </w:r>
-      <w:r>
-        <w:rPr>
-          <w:color w:val="auto"/>
-        </w:rPr>
-        <w:t>15</w:t>
-      </w:r>
-      <w:r>
-        <w:rPr>
-          <w:color w:val="auto"/>
-        </w:rPr>
-        <w:t>-1</w:t>
-      </w:r>
-      <w:r>
-        <w:rPr>
-          <w:color w:val="auto"/>
-        </w:rPr>
-        <w:t>6</w:t>
-      </w:r>
-      <w:r>
-        <w:rPr>
-          <w:color w:val="auto"/>
-        </w:rPr>
-        <w:t>:</w:t>
-      </w:r>
-      <w:r>
-        <w:rPr>
-          <w:color w:val="auto"/>
-        </w:rPr>
-        <w:t>45</w:t>
-      </w:r>
-      <w:r>
-        <w:rPr>
-          <w:color w:val="auto"/>
-        </w:rPr>
-        <w:t xml:space="preserve">, </w:t>
-      </w:r>
-      <w:r>
-        <w:rPr>
-          <w:rFonts w:ascii="Arial;sans-serif" w:hAnsi="Arial;sans-serif"/>
-          <w:b w:val="false"/>
-          <w:i w:val="false"/>
-          <w:caps w:val="false"/>
-          <w:smallCaps w:val="false"/>
-          <w:strike w:val="false"/>
-          <w:dstrike w:val="false"/>
-          <w:color w:val="000000"/>
-          <w:sz w:val="22"/>
-          <w:u w:val="none"/>
-          <w:effect w:val="none"/>
-          <w:shd w:fill="auto" w:val="clear"/>
-        </w:rPr>
-        <w:t>D</w:t>
-      </w:r>
-      <w:r>
-        <w:rPr>
-          <w:rFonts w:ascii="Arial;sans-serif" w:hAnsi="Arial;sans-serif"/>
-          <w:b w:val="false"/>
-          <w:i w:val="false"/>
-          <w:caps w:val="false"/>
-          <w:smallCaps w:val="false"/>
-          <w:strike w:val="false"/>
-          <w:dstrike w:val="false"/>
-          <w:color w:val="000000"/>
-          <w:sz w:val="22"/>
-          <w:u w:val="none"/>
-          <w:effect w:val="none"/>
-          <w:shd w:fill="auto" w:val="clear"/>
-        </w:rPr>
-        <w:t>3</w:t>
-      </w:r>
-      <w:r>
-        <w:rPr>
-          <w:rFonts w:ascii="Arial;sans-serif" w:hAnsi="Arial;sans-serif"/>
-          <w:b w:val="false"/>
-          <w:i w:val="false"/>
-          <w:caps w:val="false"/>
-          <w:smallCaps w:val="false"/>
-          <w:strike w:val="false"/>
-          <w:dstrike w:val="false"/>
-          <w:color w:val="000000"/>
-          <w:sz w:val="22"/>
-          <w:u w:val="none"/>
-          <w:effect w:val="none"/>
-          <w:shd w:fill="auto" w:val="clear"/>
-        </w:rPr>
-        <w:t>0</w:t>
-      </w:r>
-      <w:r>
-        <w:rPr>
-          <w:rFonts w:ascii="Arial;sans-serif" w:hAnsi="Arial;sans-serif"/>
-          <w:b w:val="false"/>
-          <w:i w:val="false"/>
-          <w:caps w:val="false"/>
-          <w:smallCaps w:val="false"/>
-          <w:strike w:val="false"/>
-          <w:dstrike w:val="false"/>
-          <w:color w:val="000000"/>
-          <w:sz w:val="22"/>
-          <w:u w:val="none"/>
-          <w:effect w:val="none"/>
-          <w:shd w:fill="auto" w:val="clear"/>
-        </w:rPr>
-        <w:t>1</w:t>
-      </w:r>
-      <w:r>
-        <w:rPr>
-          <w:color w:val="auto"/>
-        </w:rPr>
-        <w:br/>
-      </w:r>
-    </w:p>
-    <w:p>
-      <w:pPr>
-        <w:pStyle w:val="LO-normal"/>
-        <w:jc w:val="left"/>
-        <w:rPr>
-          <w:color w:val="auto"/>
-        </w:rPr>
-      </w:pPr>
-      <w:r>
-        <w:rPr>
-          <w:b/>
-          <w:bCs/>
-          <w:color w:val="000000"/>
-        </w:rPr>
-        <w:t>Course Description</w:t>
-      </w:r>
-    </w:p>
-    <w:p>
-      <w:pPr>
-        <w:pStyle w:val="LO-normal"/>
-        <w:pageBreakBefore w:val="false"/>
-        <w:jc w:val="left"/>
-        <w:rPr>
           <w:b w:val="false"/>
           <w:bCs w:val="false"/>
         </w:rPr>
@@ -617,15 +394,7 @@
           <w:bCs/>
           <w:color w:val="000000"/>
         </w:rPr>
-        <w:t xml:space="preserve">This is the Theory course, which works separately from the Practice one. This course has two </w:t>
-      </w:r>
-      <w:r>
-        <w:rPr>
-          <w:b/>
-          <w:bCs/>
-          <w:color w:val="000000"/>
-        </w:rPr>
-        <w:t>types of sessions:</w:t>
+        <w:t>This is the Theory course, which works separately from the Practice one. This course has two types of sessions:</w:t>
       </w:r>
     </w:p>
     <w:p>
@@ -675,47 +444,7 @@
           <w:sz w:val="24"/>
           <w:szCs w:val="24"/>
         </w:rPr>
-        <w:t xml:space="preserve">The course has a weekly, mandatory 90-minute lecture that introduces concepts and foundations in computer science. The slides for these lectures are made available </w:t>
-      </w:r>
-      <w:r>
-        <w:rPr>
-          <w:b w:val="false"/>
-          <w:bCs w:val="false"/>
-          <w:color w:val="000000"/>
-          <w:sz w:val="24"/>
-          <w:szCs w:val="24"/>
-        </w:rPr>
-        <w:t>on github</w:t>
-      </w:r>
-      <w:r>
-        <w:rPr>
-          <w:b w:val="false"/>
-          <w:bCs w:val="false"/>
-          <w:color w:val="000000"/>
-          <w:sz w:val="24"/>
-          <w:szCs w:val="24"/>
-        </w:rPr>
-        <w:t xml:space="preserve"> the </w:t>
-      </w:r>
-      <w:r>
-        <w:rPr>
-          <w:b w:val="false"/>
-          <w:bCs w:val="false"/>
-          <w:color w:val="000000"/>
-          <w:sz w:val="24"/>
-          <w:szCs w:val="24"/>
-        </w:rPr>
-        <w:t>latest on</w:t>
-      </w:r>
-      <w:r>
-        <w:rPr>
-          <w:b w:val="false"/>
-          <w:bCs w:val="false"/>
-          <w:color w:val="000000"/>
-          <w:sz w:val="24"/>
-          <w:szCs w:val="24"/>
-        </w:rPr>
-        <w:t xml:space="preserve"> day before the lecture takes place.</w:t>
+        <w:t>The course has a weekly, mandatory 90-minute lecture that introduces concepts and foundations in computer science. The slides for these lectures are made available on github the latest on day before the lecture takes place.</w:t>
       </w:r>
     </w:p>
     <w:p>
@@ -766,52 +495,14 @@
           <w:sz w:val="24"/>
           <w:szCs w:val="24"/>
         </w:rPr>
-        <w:t>E</w:t>
-      </w:r>
-      <w:r>
-        <w:rPr>
-          <w:b/>
-          <w:bCs/>
-          <w:color w:val="000000"/>
-          <w:sz w:val="24"/>
-          <w:szCs w:val="24"/>
-        </w:rPr>
-        <w:t xml:space="preserve">xercises: </w:t>
-      </w:r>
-      <w:r>
-        <w:rPr>
-          <w:sz w:val="24"/>
-          <w:szCs w:val="24"/>
-        </w:rPr>
-        <w:t xml:space="preserve">The course includes </w:t>
-      </w:r>
-      <w:r>
-        <w:rPr>
-          <w:sz w:val="24"/>
-          <w:szCs w:val="24"/>
-        </w:rPr>
-        <w:t xml:space="preserve">a weekly </w:t>
-      </w:r>
-      <w:r>
-        <w:rPr>
-          <w:sz w:val="24"/>
-          <w:szCs w:val="24"/>
-        </w:rPr>
-        <w:t xml:space="preserve">optional 90-minute session to discuss pen-and-paper exercises. These are aligned with the lectures and help to bridge theory and practice. Exercise sheets </w:t>
-      </w:r>
-      <w:r>
-        <w:rPr>
-          <w:sz w:val="24"/>
-          <w:szCs w:val="24"/>
-        </w:rPr>
-        <w:t>will be accessible in</w:t>
-      </w:r>
-      <w:r>
-        <w:rPr>
-          <w:sz w:val="24"/>
-          <w:szCs w:val="24"/>
-        </w:rPr>
-        <w:t xml:space="preserve"> advance and will serve as the basis for these sessions. These exercises help both as practice for the final written exam and to develop skills for the final projects.</w:t>
+        <w:t xml:space="preserve">Exercises: </w:t>
+      </w:r>
+      <w:r>
+        <w:rPr>
+          <w:sz w:val="24"/>
+          <w:szCs w:val="24"/>
+        </w:rPr>
+        <w:t>The course includes a weekly optional 90-minute session to discuss pen-and-paper exercises. These are aligned with the lectures and help to bridge theory and practice. Exercise sheets will be accessible in advance and will serve as the basis for these sessions. These exercises help both as practice for the final written exam and to develop skills for the final projects.</w:t>
       </w:r>
     </w:p>
     <w:p>
@@ -828,7 +519,11 @@
       </w:pPr>
       <w:r>
         <w:rPr>
-          <w:color w:val="000000"/>
+          <w:b/>
+          <w:bCs/>
+          <w:color w:val="000000"/>
+          <w:sz w:val="28"/>
+          <w:szCs w:val="28"/>
         </w:rPr>
       </w:r>
     </w:p>
@@ -890,30 +585,7 @@
           <w:sz w:val="24"/>
           <w:szCs w:val="24"/>
         </w:rPr>
-        <w:t>Ask questions in person d</w:t>
-      </w:r>
-      <w:r>
-        <w:rPr>
-          <w:color w:val="000000"/>
-          <w:sz w:val="24"/>
-          <w:szCs w:val="24"/>
-        </w:rPr>
-        <w:t xml:space="preserve">uring lectures </w:t>
-      </w:r>
-      <w:r>
-        <w:rPr>
-          <w:color w:val="000000"/>
-          <w:sz w:val="24"/>
-          <w:szCs w:val="24"/>
-        </w:rPr>
-        <w:t>or exercise sessions.</w:t>
-      </w:r>
-      <w:r>
-        <w:rPr>
-          <w:color w:val="000000"/>
-          <w:sz w:val="24"/>
-          <w:szCs w:val="24"/>
-        </w:rPr>
+        <w:t>Ask questions in person during lectures or exercise sessions.</w:t>
         <w:br/>
       </w:r>
     </w:p>
@@ -936,15 +608,7 @@
           <w:sz w:val="24"/>
           <w:szCs w:val="24"/>
         </w:rPr>
-        <w:t xml:space="preserve">Book a consultation hour with David Garcia, </w:t>
-      </w:r>
-      <w:r>
-        <w:rPr>
-          <w:color w:val="000000"/>
-          <w:sz w:val="24"/>
-          <w:szCs w:val="24"/>
-        </w:rPr>
-        <w:t>just drop an email and we will find a slot that week.</w:t>
+        <w:t>Book a consultation hour with David Garcia, just drop an email and we will find a slot that week.</w:t>
       </w:r>
     </w:p>
     <w:p>
@@ -1229,6 +893,7 @@
     <w:p>
       <w:pPr>
         <w:pStyle w:val="Heading3"/>
+        <w:spacing w:before="0" w:after="80"/>
         <w:jc w:val="left"/>
         <w:rPr>
           <w:b/>
@@ -1289,24 +954,7 @@
         </w:rPr>
         <w:t>(21.10 – 27.10)</w:t>
         <w:br/>
-      </w:r>
-      <w:r>
-        <w:rPr>
-          <w:b w:val="false"/>
-          <w:bCs w:val="false"/>
-          <w:sz w:val="22"/>
-          <w:szCs w:val="22"/>
-        </w:rPr>
-        <w:t xml:space="preserve">Intro to the course. </w:t>
-      </w:r>
-      <w:r>
-        <w:rPr>
-          <w:b w:val="false"/>
-          <w:bCs w:val="false"/>
-          <w:sz w:val="22"/>
-          <w:szCs w:val="22"/>
-        </w:rPr>
-        <w:t>W</w:t>
+        <w:t>Intro to the course. W</w:t>
       </w:r>
       <w:r>
         <w:rPr>
@@ -1339,88 +987,16 @@
           <w:sz w:val="22"/>
           <w:szCs w:val="22"/>
         </w:rPr>
-        <w:t>Session 0</w:t>
-      </w:r>
-      <w:r>
-        <w:rPr>
-          <w:b/>
-          <w:bCs/>
-          <w:sz w:val="22"/>
-          <w:szCs w:val="22"/>
-        </w:rPr>
-        <w:t xml:space="preserve">2: </w:t>
-      </w:r>
-      <w:r>
-        <w:rPr>
-          <w:b/>
-          <w:bCs/>
-          <w:sz w:val="22"/>
-          <w:szCs w:val="22"/>
-        </w:rPr>
-        <w:t>Information coding</w:t>
-      </w:r>
-      <w:r>
-        <w:rPr>
-          <w:b w:val="false"/>
-          <w:bCs w:val="false"/>
-          <w:sz w:val="22"/>
-          <w:szCs w:val="22"/>
-        </w:rPr>
-        <w:t xml:space="preserve"> (2</w:t>
-      </w:r>
-      <w:r>
-        <w:rPr>
-          <w:b w:val="false"/>
-          <w:bCs w:val="false"/>
-          <w:sz w:val="22"/>
-          <w:szCs w:val="22"/>
-        </w:rPr>
-        <w:t>8</w:t>
-      </w:r>
-      <w:r>
-        <w:rPr>
-          <w:b w:val="false"/>
-          <w:bCs w:val="false"/>
-          <w:sz w:val="22"/>
-          <w:szCs w:val="22"/>
-        </w:rPr>
-        <w:t xml:space="preserve">.10 – </w:t>
-      </w:r>
-      <w:r>
-        <w:rPr>
-          <w:b w:val="false"/>
-          <w:bCs w:val="false"/>
-          <w:sz w:val="22"/>
-          <w:szCs w:val="22"/>
-        </w:rPr>
-        <w:t>03</w:t>
-      </w:r>
-      <w:r>
-        <w:rPr>
-          <w:b w:val="false"/>
-          <w:bCs w:val="false"/>
-          <w:sz w:val="22"/>
-          <w:szCs w:val="22"/>
-        </w:rPr>
-        <w:t>.1</w:t>
-      </w:r>
-      <w:r>
-        <w:rPr>
-          <w:b w:val="false"/>
-          <w:bCs w:val="false"/>
-          <w:sz w:val="22"/>
-          <w:szCs w:val="22"/>
-        </w:rPr>
-        <w:t>1</w:t>
-      </w:r>
-      <w:r>
-        <w:rPr>
-          <w:b w:val="false"/>
-          <w:bCs w:val="false"/>
-          <w:sz w:val="22"/>
-          <w:szCs w:val="22"/>
-        </w:rPr>
-        <w:t>)</w:t>
+        <w:t>Session 02: Information coding</w:t>
+      </w:r>
+      <w:r>
+        <w:rPr>
+          <w:b w:val="false"/>
+          <w:bCs w:val="false"/>
+          <w:sz w:val="22"/>
+          <w:szCs w:val="22"/>
+        </w:rPr>
+        <w:t xml:space="preserve"> (28.10 – 03.11)</w:t>
         <w:br/>
       </w:r>
       <w:r>
@@ -1459,88 +1035,17 @@
           <w:sz w:val="22"/>
           <w:szCs w:val="22"/>
         </w:rPr>
-        <w:t>Session</w:t>
-      </w:r>
-      <w:r>
-        <w:rPr>
-          <w:b/>
-          <w:bCs/>
-          <w:sz w:val="22"/>
-          <w:szCs w:val="22"/>
-        </w:rPr>
-        <w:t xml:space="preserve"> </w:t>
-      </w:r>
-      <w:r>
-        <w:rPr>
-          <w:b/>
-          <w:bCs/>
-          <w:sz w:val="22"/>
-          <w:szCs w:val="22"/>
-        </w:rPr>
-        <w:t>0</w:t>
-      </w:r>
-      <w:r>
-        <w:rPr>
-          <w:b/>
-          <w:bCs/>
-          <w:sz w:val="22"/>
-          <w:szCs w:val="22"/>
-        </w:rPr>
-        <w:t xml:space="preserve">3: Data Structures </w:t>
-      </w:r>
-      <w:r>
-        <w:rPr>
-          <w:b w:val="false"/>
-          <w:bCs w:val="false"/>
-          <w:sz w:val="22"/>
-          <w:szCs w:val="22"/>
-        </w:rPr>
-        <w:t>(</w:t>
-      </w:r>
-      <w:r>
-        <w:rPr>
-          <w:b w:val="false"/>
-          <w:bCs w:val="false"/>
-          <w:sz w:val="22"/>
-          <w:szCs w:val="22"/>
-        </w:rPr>
-        <w:t>4</w:t>
-      </w:r>
-      <w:r>
-        <w:rPr>
-          <w:b w:val="false"/>
-          <w:bCs w:val="false"/>
-          <w:sz w:val="22"/>
-          <w:szCs w:val="22"/>
-        </w:rPr>
-        <w:t xml:space="preserve">.11 – </w:t>
-      </w:r>
-      <w:r>
-        <w:rPr>
-          <w:b w:val="false"/>
-          <w:bCs w:val="false"/>
-          <w:sz w:val="22"/>
-          <w:szCs w:val="22"/>
-        </w:rPr>
-        <w:t>13</w:t>
-      </w:r>
-      <w:r>
-        <w:rPr>
-          <w:b w:val="false"/>
-          <w:bCs w:val="false"/>
-          <w:sz w:val="22"/>
-          <w:szCs w:val="22"/>
-        </w:rPr>
-        <w:t>.11)</w:t>
+        <w:t xml:space="preserve">Session 03: Data Structures </w:t>
+      </w:r>
+      <w:r>
+        <w:rPr>
+          <w:b w:val="false"/>
+          <w:bCs w:val="false"/>
+          <w:sz w:val="22"/>
+          <w:szCs w:val="22"/>
+        </w:rPr>
+        <w:t>(4.11 – 13.11)</w:t>
         <w:br/>
-      </w:r>
-      <w:r>
-        <w:rPr>
-          <w:b w:val="false"/>
-          <w:bCs w:val="false"/>
-          <w:sz w:val="22"/>
-          <w:szCs w:val="22"/>
-        </w:rPr>
         <w:t>Abstract data structures;</w:t>
       </w:r>
       <w:r>
@@ -1582,8 +1087,6 @@
         <w:rPr>
           <w:b/>
           <w:bCs/>
-          <w:i w:val="false"/>
-          <w:iCs w:val="false"/>
           <w:sz w:val="22"/>
           <w:szCs w:val="22"/>
         </w:rPr>
@@ -1631,33 +1134,31 @@
         <w:rPr>
           <w:b/>
           <w:bCs/>
+          <w:sz w:val="22"/>
+          <w:szCs w:val="22"/>
+        </w:rPr>
+      </w:r>
+    </w:p>
+    <w:p>
+      <w:pPr>
+        <w:pStyle w:val="BodyText"/>
+        <w:jc w:val="left"/>
+        <w:rPr>
+          <w:b/>
+          <w:bCs/>
+          <w:sz w:val="22"/>
+          <w:szCs w:val="22"/>
+        </w:rPr>
+      </w:pPr>
+      <w:r>
+        <w:rPr>
+          <w:b/>
+          <w:bCs/>
           <w:i w:val="false"/>
           <w:iCs w:val="false"/>
           <w:sz w:val="22"/>
           <w:szCs w:val="22"/>
         </w:rPr>
-      </w:r>
-    </w:p>
-    <w:p>
-      <w:pPr>
-        <w:pStyle w:val="BodyText"/>
-        <w:jc w:val="left"/>
-        <w:rPr>
-          <w:b/>
-          <w:bCs/>
-          <w:sz w:val="22"/>
-          <w:szCs w:val="22"/>
-        </w:rPr>
-      </w:pPr>
-      <w:r>
-        <w:rPr>
-          <w:b/>
-          <w:bCs/>
-          <w:i w:val="false"/>
-          <w:iCs w:val="false"/>
-          <w:sz w:val="22"/>
-          <w:szCs w:val="22"/>
-        </w:rPr>
         <w:t>Session 0</w:t>
       </w:r>
       <w:r>
@@ -1667,70 +1168,17 @@
           <w:sz w:val="22"/>
           <w:szCs w:val="22"/>
         </w:rPr>
-        <w:t xml:space="preserve">4: </w:t>
-      </w:r>
-      <w:r>
-        <w:rPr>
-          <w:b/>
-          <w:bCs/>
-          <w:sz w:val="22"/>
-          <w:szCs w:val="22"/>
-        </w:rPr>
-        <w:t>Software</w:t>
-      </w:r>
-      <w:r>
-        <w:rPr>
-          <w:b w:val="false"/>
-          <w:bCs w:val="false"/>
-          <w:sz w:val="22"/>
-          <w:szCs w:val="22"/>
-        </w:rPr>
-        <w:t xml:space="preserve"> (1</w:t>
-      </w:r>
-      <w:r>
-        <w:rPr>
-          <w:b w:val="false"/>
-          <w:bCs w:val="false"/>
-          <w:sz w:val="22"/>
-          <w:szCs w:val="22"/>
-        </w:rPr>
-        <w:t>3</w:t>
-      </w:r>
-      <w:r>
-        <w:rPr>
-          <w:b w:val="false"/>
-          <w:bCs w:val="false"/>
-          <w:sz w:val="22"/>
-          <w:szCs w:val="22"/>
-        </w:rPr>
-        <w:t>.11 – 1</w:t>
-      </w:r>
-      <w:r>
-        <w:rPr>
-          <w:b w:val="false"/>
-          <w:bCs w:val="false"/>
-          <w:sz w:val="22"/>
-          <w:szCs w:val="22"/>
-        </w:rPr>
-        <w:t>7</w:t>
-      </w:r>
-      <w:r>
-        <w:rPr>
-          <w:b w:val="false"/>
-          <w:bCs w:val="false"/>
-          <w:sz w:val="22"/>
-          <w:szCs w:val="22"/>
-        </w:rPr>
-        <w:t>.11)</w:t>
+        <w:t>4: Software</w:t>
+      </w:r>
+      <w:r>
+        <w:rPr>
+          <w:b w:val="false"/>
+          <w:bCs w:val="false"/>
+          <w:sz w:val="22"/>
+          <w:szCs w:val="22"/>
+        </w:rPr>
+        <w:t xml:space="preserve"> (13.11 – 17.11)</w:t>
         <w:br/>
-      </w:r>
-      <w:r>
-        <w:rPr>
-          <w:b w:val="false"/>
-          <w:bCs w:val="false"/>
-          <w:sz w:val="22"/>
-          <w:szCs w:val="22"/>
-        </w:rPr>
         <w:t>Programming languages; good coding practices; software specifications and testing</w:t>
         <w:br/>
       </w:r>
@@ -1764,88 +1212,18 @@
           <w:sz w:val="22"/>
           <w:szCs w:val="22"/>
         </w:rPr>
-        <w:t>Session 0</w:t>
-      </w:r>
-      <w:r>
-        <w:rPr>
-          <w:b/>
-          <w:bCs/>
-          <w:sz w:val="22"/>
-          <w:szCs w:val="22"/>
-        </w:rPr>
-        <w:t xml:space="preserve">5: </w:t>
-      </w:r>
-      <w:r>
-        <w:rPr>
-          <w:b/>
-          <w:bCs/>
-          <w:sz w:val="22"/>
-          <w:szCs w:val="22"/>
-        </w:rPr>
-        <w:t>Algorithms</w:t>
-      </w:r>
-      <w:r>
-        <w:rPr>
-          <w:b w:val="false"/>
-          <w:bCs w:val="false"/>
-          <w:sz w:val="22"/>
-          <w:szCs w:val="22"/>
-        </w:rPr>
-        <w:t xml:space="preserve"> (1</w:t>
-      </w:r>
-      <w:r>
-        <w:rPr>
-          <w:b w:val="false"/>
-          <w:bCs w:val="false"/>
-          <w:sz w:val="22"/>
-          <w:szCs w:val="22"/>
-        </w:rPr>
-        <w:t>8</w:t>
-      </w:r>
-      <w:r>
-        <w:rPr>
-          <w:b w:val="false"/>
-          <w:bCs w:val="false"/>
-          <w:sz w:val="22"/>
-          <w:szCs w:val="22"/>
-        </w:rPr>
-        <w:t>.11 – 2</w:t>
-      </w:r>
-      <w:r>
-        <w:rPr>
-          <w:b w:val="false"/>
-          <w:bCs w:val="false"/>
-          <w:sz w:val="22"/>
-          <w:szCs w:val="22"/>
-        </w:rPr>
-        <w:t>4</w:t>
-      </w:r>
-      <w:r>
-        <w:rPr>
-          <w:b w:val="false"/>
-          <w:bCs w:val="false"/>
-          <w:sz w:val="22"/>
-          <w:szCs w:val="22"/>
-        </w:rPr>
-        <w:t>.11)</w:t>
+        <w:t>Session 05: Algorithms</w:t>
+      </w:r>
+      <w:r>
+        <w:rPr>
+          <w:b w:val="false"/>
+          <w:bCs w:val="false"/>
+          <w:sz w:val="22"/>
+          <w:szCs w:val="22"/>
+        </w:rPr>
+        <w:t xml:space="preserve"> (18.11 – 24.11)</w:t>
         <w:br/>
-      </w:r>
-      <w:r>
-        <w:rPr>
-          <w:b w:val="false"/>
-          <w:bCs w:val="false"/>
-          <w:sz w:val="22"/>
-          <w:szCs w:val="22"/>
-        </w:rPr>
         <w:t>Definition; examples; search algorithms</w:t>
-      </w:r>
-      <w:r>
-        <w:rPr>
-          <w:b w:val="false"/>
-          <w:bCs w:val="false"/>
-          <w:sz w:val="22"/>
-          <w:szCs w:val="22"/>
-        </w:rPr>
         <w:br/>
       </w:r>
       <w:r>
@@ -1879,16 +1257,7 @@
           <w:sz w:val="22"/>
           <w:szCs w:val="22"/>
         </w:rPr>
-        <w:t>Session 0</w:t>
-      </w:r>
-      <w:r>
-        <w:rPr>
-          <w:b/>
-          <w:bCs/>
-          <w:sz w:val="22"/>
-          <w:szCs w:val="22"/>
-        </w:rPr>
-        <w:t>6: R</w:t>
+        <w:t>Session 06: R</w:t>
       </w:r>
       <w:r>
         <w:rPr>
@@ -1907,43 +1276,7 @@
           <w:sz w:val="22"/>
           <w:szCs w:val="22"/>
         </w:rPr>
-        <w:t xml:space="preserve"> (2</w:t>
-      </w:r>
-      <w:r>
-        <w:rPr>
-          <w:b w:val="false"/>
-          <w:bCs w:val="false"/>
-          <w:sz w:val="22"/>
-          <w:szCs w:val="22"/>
-        </w:rPr>
-        <w:t>5</w:t>
-      </w:r>
-      <w:r>
-        <w:rPr>
-          <w:b w:val="false"/>
-          <w:bCs w:val="false"/>
-          <w:sz w:val="22"/>
-          <w:szCs w:val="22"/>
-        </w:rPr>
-        <w:t xml:space="preserve">.11 – </w:t>
-      </w:r>
-      <w:r>
-        <w:rPr>
-          <w:b w:val="false"/>
-          <w:bCs w:val="false"/>
-          <w:sz w:val="22"/>
-          <w:szCs w:val="22"/>
-        </w:rPr>
-        <w:t>01.12</w:t>
-      </w:r>
-      <w:r>
-        <w:rPr>
-          <w:b w:val="false"/>
-          <w:bCs w:val="false"/>
-          <w:sz w:val="22"/>
-          <w:szCs w:val="22"/>
-        </w:rPr>
-        <w:t>)</w:t>
+        <w:t xml:space="preserve"> (25.11 – 01.12)</w:t>
         <w:br/>
       </w:r>
       <w:r>
@@ -1988,61 +1321,16 @@
           <w:sz w:val="22"/>
           <w:szCs w:val="22"/>
         </w:rPr>
-        <w:t>Session 0</w:t>
-      </w:r>
-      <w:r>
-        <w:rPr>
-          <w:b/>
-          <w:bCs/>
-          <w:sz w:val="22"/>
-          <w:szCs w:val="22"/>
-        </w:rPr>
-        <w:t>7: Sorting Algorithms</w:t>
-      </w:r>
-      <w:r>
-        <w:rPr>
-          <w:b w:val="false"/>
-          <w:bCs w:val="false"/>
-          <w:sz w:val="22"/>
-          <w:szCs w:val="22"/>
-        </w:rPr>
-        <w:t xml:space="preserve"> (</w:t>
-      </w:r>
-      <w:r>
-        <w:rPr>
-          <w:b w:val="false"/>
-          <w:bCs w:val="false"/>
-          <w:sz w:val="22"/>
-          <w:szCs w:val="22"/>
-        </w:rPr>
-        <w:t>02</w:t>
-      </w:r>
-      <w:r>
-        <w:rPr>
-          <w:b w:val="false"/>
-          <w:bCs w:val="false"/>
-          <w:sz w:val="22"/>
-          <w:szCs w:val="22"/>
-        </w:rPr>
-        <w:t xml:space="preserve">.12 – </w:t>
-      </w:r>
-      <w:r>
-        <w:rPr>
-          <w:b w:val="false"/>
-          <w:bCs w:val="false"/>
-          <w:sz w:val="22"/>
-          <w:szCs w:val="22"/>
-        </w:rPr>
-        <w:t>08</w:t>
-      </w:r>
-      <w:r>
-        <w:rPr>
-          <w:b w:val="false"/>
-          <w:bCs w:val="false"/>
-          <w:sz w:val="22"/>
-          <w:szCs w:val="22"/>
-        </w:rPr>
-        <w:t>.12)</w:t>
+        <w:t>Session 07: Sorting Algorithms</w:t>
+      </w:r>
+      <w:r>
+        <w:rPr>
+          <w:b w:val="false"/>
+          <w:bCs w:val="false"/>
+          <w:sz w:val="22"/>
+          <w:szCs w:val="22"/>
+        </w:rPr>
+        <w:t xml:space="preserve"> (02.12 – 08.12)</w:t>
         <w:br/>
       </w:r>
       <w:r>
@@ -2081,88 +1369,16 @@
           <w:sz w:val="22"/>
           <w:szCs w:val="22"/>
         </w:rPr>
-        <w:t>Session</w:t>
-      </w:r>
-      <w:r>
-        <w:rPr>
-          <w:b/>
-          <w:bCs/>
-          <w:sz w:val="22"/>
-          <w:szCs w:val="22"/>
-        </w:rPr>
-        <w:t xml:space="preserve"> </w:t>
-      </w:r>
-      <w:r>
-        <w:rPr>
-          <w:b/>
-          <w:bCs/>
-          <w:sz w:val="22"/>
-          <w:szCs w:val="22"/>
-        </w:rPr>
-        <w:t>0</w:t>
-      </w:r>
-      <w:r>
-        <w:rPr>
-          <w:b/>
-          <w:bCs/>
-          <w:sz w:val="22"/>
-          <w:szCs w:val="22"/>
-        </w:rPr>
-        <w:t xml:space="preserve">8: </w:t>
-      </w:r>
-      <w:r>
-        <w:rPr>
-          <w:b/>
-          <w:bCs/>
-          <w:sz w:val="22"/>
-          <w:szCs w:val="22"/>
-        </w:rPr>
-        <w:t>Algorithmic Complexity</w:t>
-      </w:r>
-      <w:r>
-        <w:rPr>
-          <w:b w:val="false"/>
-          <w:bCs w:val="false"/>
-          <w:sz w:val="22"/>
-          <w:szCs w:val="22"/>
-        </w:rPr>
-        <w:t xml:space="preserve"> (</w:t>
-      </w:r>
-      <w:r>
-        <w:rPr>
-          <w:b w:val="false"/>
-          <w:bCs w:val="false"/>
-          <w:sz w:val="22"/>
-          <w:szCs w:val="22"/>
-        </w:rPr>
-        <w:t>09</w:t>
-      </w:r>
-      <w:r>
-        <w:rPr>
-          <w:b w:val="false"/>
-          <w:bCs w:val="false"/>
-          <w:sz w:val="22"/>
-          <w:szCs w:val="22"/>
-        </w:rPr>
-        <w:t>.12 – 1</w:t>
-      </w:r>
-      <w:r>
-        <w:rPr>
-          <w:b w:val="false"/>
-          <w:bCs w:val="false"/>
-          <w:sz w:val="22"/>
-          <w:szCs w:val="22"/>
-        </w:rPr>
-        <w:t>5</w:t>
-      </w:r>
-      <w:r>
-        <w:rPr>
-          <w:b w:val="false"/>
-          <w:bCs w:val="false"/>
-          <w:sz w:val="22"/>
-          <w:szCs w:val="22"/>
-        </w:rPr>
-        <w:t>.12)</w:t>
+        <w:t>Session 08: Algorithmic Complexity</w:t>
+      </w:r>
+      <w:r>
+        <w:rPr>
+          <w:b w:val="false"/>
+          <w:bCs w:val="false"/>
+          <w:sz w:val="22"/>
+          <w:szCs w:val="22"/>
+        </w:rPr>
+        <w:t xml:space="preserve"> (09.12 – 15.12)</w:t>
         <w:br/>
         <w:t>Runtime analysis; Asymptotic notation; Applications to search and sorting</w:t>
         <w:br/>
@@ -2217,106 +1433,16 @@
           <w:sz w:val="22"/>
           <w:szCs w:val="22"/>
         </w:rPr>
-        <w:t>Session 0</w:t>
-      </w:r>
-      <w:r>
-        <w:rPr>
-          <w:b/>
-          <w:bCs/>
-          <w:sz w:val="22"/>
-          <w:szCs w:val="22"/>
-        </w:rPr>
-        <w:t>9</w:t>
-      </w:r>
-      <w:r>
-        <w:rPr>
-          <w:b/>
-          <w:bCs/>
-          <w:sz w:val="22"/>
-          <w:szCs w:val="22"/>
-        </w:rPr>
-        <w:t>: Theoretical Computer Science</w:t>
-      </w:r>
-      <w:r>
-        <w:rPr>
-          <w:b w:val="false"/>
-          <w:bCs w:val="false"/>
-          <w:sz w:val="22"/>
-          <w:szCs w:val="22"/>
-        </w:rPr>
-        <w:t xml:space="preserve"> (</w:t>
-      </w:r>
-      <w:r>
-        <w:rPr>
-          <w:b w:val="false"/>
-          <w:bCs w:val="false"/>
-          <w:sz w:val="22"/>
-          <w:szCs w:val="22"/>
-        </w:rPr>
-        <w:t>16</w:t>
-      </w:r>
-      <w:r>
-        <w:rPr>
-          <w:b w:val="false"/>
-          <w:bCs w:val="false"/>
-          <w:sz w:val="22"/>
-          <w:szCs w:val="22"/>
-        </w:rPr>
-        <w:t>.</w:t>
-      </w:r>
-      <w:r>
-        <w:rPr>
-          <w:b w:val="false"/>
-          <w:bCs w:val="false"/>
-          <w:sz w:val="22"/>
-          <w:szCs w:val="22"/>
-        </w:rPr>
-        <w:t>12</w:t>
-      </w:r>
-      <w:r>
-        <w:rPr>
-          <w:b w:val="false"/>
-          <w:bCs w:val="false"/>
-          <w:sz w:val="22"/>
-          <w:szCs w:val="22"/>
-        </w:rPr>
-        <w:t xml:space="preserve"> - </w:t>
-      </w:r>
-      <w:r>
-        <w:rPr>
-          <w:b w:val="false"/>
-          <w:bCs w:val="false"/>
-          <w:sz w:val="22"/>
-          <w:szCs w:val="22"/>
-        </w:rPr>
-        <w:t>12</w:t>
-      </w:r>
-      <w:r>
-        <w:rPr>
-          <w:b w:val="false"/>
-          <w:bCs w:val="false"/>
-          <w:sz w:val="22"/>
-          <w:szCs w:val="22"/>
-        </w:rPr>
-        <w:t>.</w:t>
-      </w:r>
-      <w:r>
-        <w:rPr>
-          <w:b w:val="false"/>
-          <w:bCs w:val="false"/>
-          <w:sz w:val="22"/>
-          <w:szCs w:val="22"/>
-        </w:rPr>
-        <w:t>0</w:t>
-      </w:r>
-      <w:r>
-        <w:rPr>
-          <w:b w:val="false"/>
-          <w:bCs w:val="false"/>
-          <w:sz w:val="22"/>
-          <w:szCs w:val="22"/>
-        </w:rPr>
-        <w:t>1)</w:t>
+        <w:t>Session 09: Theoretical Computer Science</w:t>
+      </w:r>
+      <w:r>
+        <w:rPr>
+          <w:b w:val="false"/>
+          <w:bCs w:val="false"/>
+          <w:sz w:val="22"/>
+          <w:szCs w:val="22"/>
+        </w:rPr>
+        <w:t xml:space="preserve"> (16.12 - 12.01)</w:t>
         <w:br/>
         <w:t>Models of computation (DFA, PDA, Turing Machines), Complexity Classes</w:t>
         <w:br/>
@@ -2360,48 +1486,84 @@
           <w:sz w:val="22"/>
           <w:szCs w:val="22"/>
         </w:rPr>
-        <w:t xml:space="preserve">Session </w:t>
-      </w:r>
-      <w:r>
-        <w:rPr>
-          <w:b/>
-          <w:bCs/>
-          <w:sz w:val="22"/>
-          <w:szCs w:val="22"/>
-        </w:rPr>
-        <w:t>10: Machine Learning</w:t>
-      </w:r>
-      <w:r>
-        <w:rPr>
-          <w:b w:val="false"/>
-          <w:bCs w:val="false"/>
-          <w:sz w:val="22"/>
-          <w:szCs w:val="22"/>
-        </w:rPr>
-        <w:t xml:space="preserve"> (13.</w:t>
-      </w:r>
-      <w:r>
-        <w:rPr>
-          <w:b w:val="false"/>
-          <w:bCs w:val="false"/>
-          <w:sz w:val="22"/>
-          <w:szCs w:val="22"/>
-        </w:rPr>
-        <w:t xml:space="preserve">01 </w:t>
-      </w:r>
-      <w:r>
-        <w:rPr>
-          <w:b w:val="false"/>
-          <w:bCs w:val="false"/>
-          <w:sz w:val="22"/>
-          <w:szCs w:val="22"/>
-        </w:rPr>
-        <w:t xml:space="preserve"> - </w:t>
-      </w:r>
-      <w:r>
-        <w:rPr>
-          <w:b w:val="false"/>
-          <w:bCs w:val="false"/>
+        <w:t>Session 1</w:t>
+      </w:r>
+      <w:r>
+        <w:rPr>
+          <w:b/>
+          <w:bCs/>
+          <w:sz w:val="22"/>
+          <w:szCs w:val="22"/>
+        </w:rPr>
+        <w:t>0</w:t>
+      </w:r>
+      <w:r>
+        <w:rPr>
+          <w:b/>
+          <w:bCs/>
+          <w:sz w:val="22"/>
+          <w:szCs w:val="22"/>
+        </w:rPr>
+        <w:t>: Databases</w:t>
+      </w:r>
+      <w:r>
+        <w:rPr>
+          <w:b w:val="false"/>
+          <w:bCs w:val="false"/>
+          <w:sz w:val="22"/>
+          <w:szCs w:val="22"/>
+        </w:rPr>
+        <w:t xml:space="preserve"> (13.01  - 19.01)</w:t>
+        <w:br/>
+      </w:r>
+      <w:r>
+        <w:rPr>
+          <w:b w:val="false"/>
+          <w:bCs w:val="false"/>
+          <w:color w:val="000000"/>
+          <w:sz w:val="22"/>
+          <w:szCs w:val="22"/>
+        </w:rPr>
+        <w:t>Database management systems; Tables, SQL, relational algebra</w:t>
+        <w:br/>
+      </w:r>
+      <w:r>
+        <w:rPr>
+          <w:b w:val="false"/>
+          <w:bCs w:val="false"/>
+          <w:i/>
+          <w:iCs/>
+          <w:color w:val="000000"/>
+          <w:sz w:val="22"/>
+          <w:szCs w:val="22"/>
+        </w:rPr>
+        <w:t>Reference(s): Chapter 4 of ‘Big Data and Social Science: A Practical Guide to Methods and Tools’ by Foster, Ghani, Jarmin, Kreuter and Lane.</w:t>
+      </w:r>
+    </w:p>
+    <w:p>
+      <w:pPr>
+        <w:pStyle w:val="BodyText"/>
+        <w:jc w:val="left"/>
+        <w:rPr>
+          <w:b/>
+          <w:bCs/>
+          <w:sz w:val="22"/>
+          <w:szCs w:val="22"/>
+        </w:rPr>
+      </w:pPr>
+      <w:r>
+        <w:rPr>
+          <w:b/>
+          <w:bCs/>
+          <w:sz w:val="22"/>
+          <w:szCs w:val="22"/>
+        </w:rPr>
+        <w:t>Session 1</w:t>
+      </w:r>
+      <w:r>
+        <w:rPr>
+          <w:b/>
+          <w:bCs/>
           <w:sz w:val="22"/>
           <w:szCs w:val="22"/>
         </w:rPr>
@@ -2409,30 +1571,21 @@
       </w:r>
       <w:r>
         <w:rPr>
-          <w:b w:val="false"/>
-          <w:bCs w:val="false"/>
-          <w:sz w:val="22"/>
-          <w:szCs w:val="22"/>
-        </w:rPr>
-        <w:t>9.</w:t>
-      </w:r>
-      <w:r>
-        <w:rPr>
-          <w:b w:val="false"/>
-          <w:bCs w:val="false"/>
-          <w:sz w:val="22"/>
-          <w:szCs w:val="22"/>
-        </w:rPr>
-        <w:t>0</w:t>
-      </w:r>
-      <w:r>
-        <w:rPr>
-          <w:b w:val="false"/>
-          <w:bCs w:val="false"/>
-          <w:sz w:val="22"/>
-          <w:szCs w:val="22"/>
-        </w:rPr>
-        <w:t>1)</w:t>
+          <w:b/>
+          <w:bCs/>
+          <w:sz w:val="22"/>
+          <w:szCs w:val="22"/>
+        </w:rPr>
+        <w:t>: Machine Learning</w:t>
+      </w:r>
+      <w:r>
+        <w:rPr>
+          <w:b w:val="false"/>
+          <w:bCs w:val="false"/>
+          <w:sz w:val="22"/>
+          <w:szCs w:val="22"/>
+        </w:rPr>
+        <w:t xml:space="preserve"> (20.01 - 26.01)</w:t>
         <w:br/>
         <w:t>Supervised and unsupervised machine learning. Bias-variance tradeoff</w:t>
         <w:br/>
@@ -2464,106 +1617,16 @@
           <w:sz w:val="22"/>
           <w:szCs w:val="22"/>
         </w:rPr>
-        <w:t>Session</w:t>
-      </w:r>
-      <w:r>
-        <w:rPr>
-          <w:b/>
-          <w:bCs/>
-          <w:sz w:val="22"/>
-          <w:szCs w:val="22"/>
-        </w:rPr>
-        <w:t xml:space="preserve"> 11: </w:t>
-      </w:r>
-      <w:r>
-        <w:rPr>
-          <w:b/>
-          <w:bCs/>
-          <w:sz w:val="22"/>
-          <w:szCs w:val="22"/>
-        </w:rPr>
-        <w:t>Databases</w:t>
-      </w:r>
-      <w:r>
-        <w:rPr>
-          <w:b w:val="false"/>
-          <w:bCs w:val="false"/>
-          <w:sz w:val="22"/>
-          <w:szCs w:val="22"/>
-        </w:rPr>
-        <w:t xml:space="preserve"> (</w:t>
-      </w:r>
-      <w:r>
-        <w:rPr>
-          <w:b w:val="false"/>
-          <w:bCs w:val="false"/>
-          <w:sz w:val="22"/>
-          <w:szCs w:val="22"/>
-        </w:rPr>
-        <w:t>20</w:t>
-      </w:r>
-      <w:r>
-        <w:rPr>
-          <w:b w:val="false"/>
-          <w:bCs w:val="false"/>
-          <w:sz w:val="22"/>
-          <w:szCs w:val="22"/>
-        </w:rPr>
-        <w:t>.</w:t>
-      </w:r>
-      <w:r>
-        <w:rPr>
-          <w:b w:val="false"/>
-          <w:bCs w:val="false"/>
-          <w:sz w:val="22"/>
-          <w:szCs w:val="22"/>
-        </w:rPr>
-        <w:t>0</w:t>
-      </w:r>
-      <w:r>
-        <w:rPr>
-          <w:b w:val="false"/>
-          <w:bCs w:val="false"/>
-          <w:sz w:val="22"/>
-          <w:szCs w:val="22"/>
-        </w:rPr>
-        <w:t xml:space="preserve">1 - </w:t>
-      </w:r>
-      <w:r>
-        <w:rPr>
-          <w:b w:val="false"/>
-          <w:bCs w:val="false"/>
-          <w:sz w:val="22"/>
-          <w:szCs w:val="22"/>
-        </w:rPr>
-        <w:t>2</w:t>
-      </w:r>
-      <w:r>
-        <w:rPr>
-          <w:b w:val="false"/>
-          <w:bCs w:val="false"/>
-          <w:sz w:val="22"/>
-          <w:szCs w:val="22"/>
-        </w:rPr>
-        <w:t>6.</w:t>
-      </w:r>
-      <w:r>
-        <w:rPr>
-          <w:b w:val="false"/>
-          <w:bCs w:val="false"/>
-          <w:sz w:val="22"/>
-          <w:szCs w:val="22"/>
-        </w:rPr>
-        <w:t>0</w:t>
-      </w:r>
-      <w:r>
-        <w:rPr>
-          <w:b w:val="false"/>
-          <w:bCs w:val="false"/>
-          <w:sz w:val="22"/>
-          <w:szCs w:val="22"/>
-        </w:rPr>
-        <w:t>1)</w:t>
+        <w:t>Session 12: Parallel Programming</w:t>
+      </w:r>
+      <w:r>
+        <w:rPr>
+          <w:b w:val="false"/>
+          <w:bCs w:val="false"/>
+          <w:sz w:val="22"/>
+          <w:szCs w:val="22"/>
+        </w:rPr>
+        <w:t xml:space="preserve"> (27.01 – 02.02)</w:t>
         <w:br/>
       </w:r>
       <w:r>
@@ -2574,7 +1637,16 @@
           <w:sz w:val="22"/>
           <w:szCs w:val="22"/>
         </w:rPr>
-        <w:t>Database management systems; Tables, SQL, relational algebra</w:t>
+        <w:t>Hardware and software parallelization, limits of parallelization</w:t>
+      </w:r>
+      <w:r>
+        <w:rPr>
+          <w:b/>
+          <w:bCs/>
+          <w:color w:val="000000"/>
+          <w:sz w:val="22"/>
+          <w:szCs w:val="22"/>
+        </w:rPr>
         <w:br/>
       </w:r>
       <w:r>
@@ -2587,158 +1659,87 @@
           <w:sz w:val="22"/>
           <w:szCs w:val="22"/>
         </w:rPr>
-        <w:t>Reference(s): Chapter 4 of ‘Big Data and Social Science: A Practical Guide to Methods and Tools’ by Foster, Ghani, Jarmin, Kreuter and Lane.</w:t>
-      </w:r>
-    </w:p>
-    <w:p>
-      <w:pPr>
-        <w:pStyle w:val="BodyText"/>
-        <w:pageBreakBefore w:val="false"/>
-        <w:jc w:val="left"/>
-        <w:rPr/>
-      </w:pPr>
-      <w:r>
-        <w:rPr>
-          <w:b/>
-          <w:bCs/>
-          <w:sz w:val="22"/>
-          <w:szCs w:val="22"/>
-        </w:rPr>
-        <w:t xml:space="preserve">Session </w:t>
-      </w:r>
-      <w:r>
-        <w:rPr>
-          <w:b/>
-          <w:bCs/>
-          <w:sz w:val="22"/>
-          <w:szCs w:val="22"/>
-        </w:rPr>
-        <w:t>12: Parallel Programming</w:t>
-      </w:r>
-      <w:r>
-        <w:rPr>
-          <w:b w:val="false"/>
-          <w:bCs w:val="false"/>
-          <w:sz w:val="22"/>
-          <w:szCs w:val="22"/>
-        </w:rPr>
-        <w:t xml:space="preserve"> (</w:t>
-      </w:r>
-      <w:r>
-        <w:rPr>
-          <w:b w:val="false"/>
-          <w:bCs w:val="false"/>
-          <w:sz w:val="22"/>
-          <w:szCs w:val="22"/>
-        </w:rPr>
-        <w:t>27</w:t>
-      </w:r>
-      <w:r>
-        <w:rPr>
-          <w:b w:val="false"/>
-          <w:bCs w:val="false"/>
-          <w:sz w:val="22"/>
-          <w:szCs w:val="22"/>
-        </w:rPr>
-        <w:t>.</w:t>
-      </w:r>
-      <w:r>
-        <w:rPr>
-          <w:b w:val="false"/>
-          <w:bCs w:val="false"/>
-          <w:sz w:val="22"/>
-          <w:szCs w:val="22"/>
-        </w:rPr>
-        <w:t>0</w:t>
-      </w:r>
-      <w:r>
-        <w:rPr>
-          <w:b w:val="false"/>
-          <w:bCs w:val="false"/>
-          <w:sz w:val="22"/>
-          <w:szCs w:val="22"/>
-        </w:rPr>
-        <w:t xml:space="preserve">1 – </w:t>
-      </w:r>
-      <w:r>
-        <w:rPr>
-          <w:b w:val="false"/>
-          <w:bCs w:val="false"/>
-          <w:sz w:val="22"/>
-          <w:szCs w:val="22"/>
-        </w:rPr>
-        <w:t>02</w:t>
-      </w:r>
-      <w:r>
-        <w:rPr>
-          <w:b w:val="false"/>
-          <w:bCs w:val="false"/>
-          <w:sz w:val="22"/>
-          <w:szCs w:val="22"/>
-        </w:rPr>
-        <w:t>.</w:t>
-      </w:r>
-      <w:r>
-        <w:rPr>
-          <w:b w:val="false"/>
-          <w:bCs w:val="false"/>
-          <w:sz w:val="22"/>
-          <w:szCs w:val="22"/>
-        </w:rPr>
-        <w:t>02</w:t>
-      </w:r>
-      <w:r>
-        <w:rPr>
-          <w:b w:val="false"/>
-          <w:bCs w:val="false"/>
-          <w:sz w:val="22"/>
-          <w:szCs w:val="22"/>
-        </w:rPr>
-        <w:t>)</w:t>
-        <w:br/>
-      </w:r>
-      <w:r>
-        <w:rPr>
-          <w:b w:val="false"/>
-          <w:bCs w:val="false"/>
-          <w:color w:val="000000"/>
-          <w:sz w:val="22"/>
-          <w:szCs w:val="22"/>
-        </w:rPr>
-        <w:t>Hardware and software parallelization, limits of parallelization</w:t>
-      </w:r>
-      <w:r>
-        <w:rPr>
-          <w:b/>
-          <w:bCs/>
-          <w:color w:val="000000"/>
-          <w:sz w:val="22"/>
-          <w:szCs w:val="22"/>
-        </w:rPr>
-        <w:br/>
-      </w:r>
-      <w:r>
-        <w:rPr>
-          <w:b w:val="false"/>
-          <w:bCs w:val="false"/>
+        <w:t>Reference(s): Chapter 4.8 of ‘Composing Programs’ by DeNero.</w:t>
+      </w:r>
+      <w:r>
+        <w:rPr>
+          <w:b/>
+          <w:bCs/>
           <w:i/>
           <w:iCs/>
           <w:color w:val="000000"/>
           <w:sz w:val="22"/>
           <w:szCs w:val="22"/>
         </w:rPr>
-        <w:t>Reference(s): Chapter 4.8 of ‘Composing Programs’ by DeNero.</w:t>
-      </w:r>
-      <w:r>
-        <w:rPr>
-          <w:b/>
-          <w:bCs/>
+        <w:br/>
+      </w:r>
+      <w:r>
+        <w:rPr>
+          <w:b w:val="false"/>
+          <w:bCs w:val="false"/>
           <w:i/>
           <w:iCs/>
           <w:color w:val="000000"/>
           <w:sz w:val="22"/>
           <w:szCs w:val="22"/>
         </w:rPr>
+        <w:t>Chapter 5 of ‘Big Data and Social Science: A Practical Guide to Methods and Tools’ by Foster, Ghani, Jarmin, Kreuter and Lane.</w:t>
+      </w:r>
+    </w:p>
+    <w:p>
+      <w:pPr>
+        <w:pStyle w:val="BodyText"/>
+        <w:jc w:val="left"/>
+        <w:rPr>
+          <w:b/>
+          <w:bCs/>
+          <w:i w:val="false"/>
+          <w:iCs w:val="false"/>
+          <w:sz w:val="22"/>
+          <w:szCs w:val="22"/>
+        </w:rPr>
+      </w:pPr>
+      <w:r>
+        <w:rPr>
+          <w:b/>
+          <w:bCs/>
+          <w:i w:val="false"/>
+          <w:iCs w:val="false"/>
+          <w:sz w:val="22"/>
+          <w:szCs w:val="22"/>
+        </w:rPr>
+        <w:t>Session 13: Social Science Applications</w:t>
+      </w:r>
+      <w:r>
+        <w:rPr>
+          <w:b w:val="false"/>
+          <w:bCs w:val="false"/>
+          <w:i w:val="false"/>
+          <w:iCs w:val="false"/>
+          <w:sz w:val="22"/>
+          <w:szCs w:val="22"/>
+        </w:rPr>
+        <w:t xml:space="preserve"> (03.02, no exercise)</w:t>
+        <w:br/>
+      </w:r>
+      <w:r>
+        <w:rPr>
+          <w:b w:val="false"/>
+          <w:bCs w:val="false"/>
+          <w:sz w:val="22"/>
+          <w:szCs w:val="22"/>
+        </w:rPr>
+        <w:t>A</w:t>
+      </w:r>
+      <w:r>
+        <w:rPr>
+          <w:b w:val="false"/>
+          <w:bCs w:val="false"/>
+          <w:color w:val="000000"/>
+          <w:sz w:val="22"/>
+          <w:szCs w:val="22"/>
+        </w:rPr>
+        <w:t>pplications of computational approaches to social science research including measurement, analysis, theory-building, and data retrieval.</w:t>
         <w:br/>
       </w:r>
       <w:r>
@@ -2751,7 +1752,7 @@
           <w:sz w:val="22"/>
           <w:szCs w:val="22"/>
         </w:rPr>
-        <w:t>Chapter 5 of ‘Big Data and Social Science: A Practical Guide to Methods and Tools’ by Foster, Ghani, Jarmin, Kreuter and Lane.</w:t>
+        <w:t>Reference(s): Lecture materials</w:t>
       </w:r>
     </w:p>
     <w:p>
@@ -2776,9 +1777,13 @@
           <w:sz w:val="22"/>
           <w:szCs w:val="22"/>
         </w:rPr>
-        <w:t>Session</w:t>
-      </w:r>
-      <w:r>
+        <w:t>There will be an extra exercise session on the week of 08.02-12.02 to do Q&amp;A and en exam example.</w:t>
+      </w:r>
+    </w:p>
+    <w:p>
+      <w:pPr>
+        <w:pStyle w:val="BodyText"/>
+        <w:jc w:val="left"/>
         <w:rPr>
           <w:b/>
           <w:bCs/>
@@ -2787,68 +1792,32 @@
           <w:sz w:val="22"/>
           <w:szCs w:val="22"/>
         </w:rPr>
-        <w:t xml:space="preserve"> 13: Social Science Applications</w:t>
-      </w:r>
-      <w:r>
-        <w:rPr>
-          <w:b w:val="false"/>
-          <w:bCs w:val="false"/>
+      </w:pPr>
+      <w:r>
+        <w:rPr>
+          <w:b/>
+          <w:bCs/>
           <w:i w:val="false"/>
           <w:iCs w:val="false"/>
           <w:sz w:val="22"/>
           <w:szCs w:val="22"/>
         </w:rPr>
-        <w:t xml:space="preserve"> (</w:t>
-      </w:r>
-      <w:r>
-        <w:rPr>
-          <w:b w:val="false"/>
-          <w:bCs w:val="false"/>
+      </w:r>
+    </w:p>
+    <w:p>
+      <w:pPr>
+        <w:pStyle w:val="BodyText"/>
+        <w:jc w:val="left"/>
+        <w:rPr>
+          <w:b/>
+          <w:bCs/>
           <w:i w:val="false"/>
           <w:iCs w:val="false"/>
           <w:sz w:val="22"/>
           <w:szCs w:val="22"/>
         </w:rPr>
-        <w:t>03.02, no exercise)</w:t>
-        <w:br/>
-      </w:r>
-      <w:r>
-        <w:rPr>
-          <w:b w:val="false"/>
-          <w:bCs w:val="false"/>
-          <w:sz w:val="22"/>
-          <w:szCs w:val="22"/>
-        </w:rPr>
-        <w:t>A</w:t>
-      </w:r>
-      <w:r>
-        <w:rPr>
-          <w:b w:val="false"/>
-          <w:bCs w:val="false"/>
-          <w:color w:val="000000"/>
-          <w:sz w:val="22"/>
-          <w:szCs w:val="22"/>
-        </w:rPr>
-        <w:t>pplications of computational approaches to social science research including measurement, analysis, theory-building, and data retrieval.</w:t>
-        <w:br/>
-      </w:r>
-      <w:r>
-        <w:rPr>
-          <w:b w:val="false"/>
-          <w:bCs w:val="false"/>
-          <w:i/>
-          <w:iCs/>
-          <w:color w:val="000000"/>
-          <w:sz w:val="22"/>
-          <w:szCs w:val="22"/>
-        </w:rPr>
-        <w:t>Reference(s): Lecture materials</w:t>
-      </w:r>
-    </w:p>
-    <w:p>
-      <w:pPr>
-        <w:pStyle w:val="BodyText"/>
-        <w:jc w:val="left"/>
+      </w:pPr>
+      <w:r>
         <w:rPr>
           <w:b/>
           <w:bCs/>
@@ -2857,65 +1826,6 @@
           <w:sz w:val="22"/>
           <w:szCs w:val="22"/>
         </w:rPr>
-      </w:pPr>
-      <w:r>
-        <w:rPr>
-          <w:b/>
-          <w:bCs/>
-          <w:i w:val="false"/>
-          <w:iCs w:val="false"/>
-          <w:sz w:val="22"/>
-          <w:szCs w:val="22"/>
-        </w:rPr>
-        <w:t>There will be an extra exercise session on the week of 08.02-12.02 to do Q&amp;A and en exam example.</w:t>
-      </w:r>
-    </w:p>
-    <w:p>
-      <w:pPr>
-        <w:pStyle w:val="BodyText"/>
-        <w:jc w:val="left"/>
-        <w:rPr>
-          <w:b/>
-          <w:bCs/>
-          <w:i w:val="false"/>
-          <w:iCs w:val="false"/>
-          <w:sz w:val="22"/>
-          <w:szCs w:val="22"/>
-        </w:rPr>
-      </w:pPr>
-      <w:r>
-        <w:rPr>
-          <w:b/>
-          <w:bCs/>
-          <w:i w:val="false"/>
-          <w:iCs w:val="false"/>
-          <w:sz w:val="22"/>
-          <w:szCs w:val="22"/>
-        </w:rPr>
-      </w:r>
-    </w:p>
-    <w:p>
-      <w:pPr>
-        <w:pStyle w:val="BodyText"/>
-        <w:jc w:val="left"/>
-        <w:rPr>
-          <w:b/>
-          <w:bCs/>
-          <w:i w:val="false"/>
-          <w:iCs w:val="false"/>
-          <w:sz w:val="22"/>
-          <w:szCs w:val="22"/>
-        </w:rPr>
-      </w:pPr>
-      <w:r>
-        <w:rPr>
-          <w:b/>
-          <w:bCs/>
-          <w:i w:val="false"/>
-          <w:iCs w:val="false"/>
-          <w:sz w:val="22"/>
-          <w:szCs w:val="22"/>
-        </w:rPr>
       </w:r>
     </w:p>
     <w:p>
@@ -2935,17 +1845,7 @@
           <w:sz w:val="28"/>
           <w:szCs w:val="28"/>
         </w:rPr>
-        <w:t>Grading</w:t>
-      </w:r>
-      <w:r>
-        <w:rPr>
-          <w:b/>
-          <w:bCs/>
-          <w:color w:val="000000"/>
-          <w:sz w:val="28"/>
-          <w:szCs w:val="28"/>
-        </w:rPr>
-        <w:t xml:space="preserve"> : Introduction to Computing for the Social Sciences (Theory) POL-31760  (6 ECTS)</w:t>
+        <w:t>Grading : Introduction to Computing for the Social Sciences (Theory) POL-31760  (6 ECTS)</w:t>
       </w:r>
     </w:p>
     <w:p>
@@ -2997,39 +1897,7 @@
           <w:bCs w:val="false"/>
           <w:color w:val="000000"/>
         </w:rPr>
-        <w:t xml:space="preserve"> </w:t>
-      </w:r>
-      <w:r>
-        <w:rPr>
-          <w:b w:val="false"/>
-          <w:bCs w:val="false"/>
-          <w:color w:val="000000"/>
-        </w:rPr>
-        <w:t xml:space="preserve">the theory and practice parts are separate courses and are graded  </w:t>
-      </w:r>
-      <w:r>
-        <w:rPr>
-          <w:b w:val="false"/>
-          <w:bCs w:val="false"/>
-          <w:color w:val="000000"/>
-        </w:rPr>
-        <w:t xml:space="preserve">separately. </w:t>
-      </w:r>
-      <w:r>
-        <w:rPr>
-          <w:b w:val="false"/>
-          <w:bCs w:val="false"/>
-          <w:color w:val="000000"/>
-        </w:rPr>
-        <w:t>I</w:t>
-      </w:r>
-      <w:r>
-        <w:rPr>
-          <w:b w:val="false"/>
-          <w:bCs w:val="false"/>
-          <w:color w:val="000000"/>
-        </w:rPr>
-        <w:t>t is possible to pass one and not the other. For the theory part there is a resit exam and the standard number of tries is two. You do not need to pass both parts the same year but we strongly recommend that you focus on passing both on your first semester to be ready for CS courses from the second semester.</w:t>
+        <w:t xml:space="preserve"> the theory and practice parts are separate courses and are graded  separately. It is possible to pass one and not the other. For the theory part there is a resit exam and the standard number of tries is two. You do not need to pass both parts the same year but we strongly recommend that you focus on passing both on your first semester to be ready for CS courses from the second semester.</w:t>
       </w:r>
     </w:p>
     <w:sectPr>
@@ -3871,8 +2739,8 @@
       <w:szCs w:val="22"/>
     </w:rPr>
   </w:style>
-  <w:style w:type="character" w:styleId="Bulletsuser">
-    <w:name w:val="Bullets (user)"/>
+  <w:style w:type="character" w:styleId="Bullets">
+    <w:name w:val="Bullets"/>
     <w:qFormat/>
     <w:rPr>
       <w:rFonts w:ascii="OpenSymbol" w:hAnsi="OpenSymbol" w:eastAsia="OpenSymbol" w:cs="OpenSymbol"/>
@@ -3892,8 +2760,8 @@
       <w:u w:val="single"/>
     </w:rPr>
   </w:style>
-  <w:style w:type="character" w:styleId="Bullets">
-    <w:name w:val="Bullets"/>
+  <w:style w:type="character" w:styleId="Bulletsuser">
+    <w:name w:val="Bullets (user)"/>
     <w:qFormat/>
     <w:rPr>
       <w:rFonts w:ascii="OpenSymbol" w:hAnsi="OpenSymbol" w:eastAsia="OpenSymbol" w:cs="OpenSymbol"/>

</xml_diff>